<commit_message>
Add Financial Forecasting skill, update Cowork docs and CLAUDE.md
- Add Financial Forecasting SKILL.md for time series forecasting (ARIMA/Prophet)
- Expand README-BCowork.md with skills, plugins, and data analysis demo docs
- Update Prompt Library with revised data analysis plugin workflow
- Update Claude Cowork slides (pptx)
- Tighten CLAUDE.md: fix README numbering, expand Skills/Materials sections, simplify MCP docs, add GitHub MCP server

Co-Authored-By: Claude Sonnet 4.6 <noreply@anthropic.com>
</commit_message>
<xml_diff>
--- a/Claude Masterclass Materials/Claude Masterclass - Prompt Library.docx
+++ b/Claude Masterclass Materials/Claude Masterclass - Prompt Library.docx
@@ -268,21 +268,7 @@
         <w:rPr>
           <w:rFonts w:ascii="Montserrat" w:hAnsi="Montserrat"/>
         </w:rPr>
-        <w:t xml:space="preserve">Organize the folder into categories: receipts, invoices, and agreements. Then I want you to add the total receipts and export them </w:t>
-      </w:r>
-      <w:proofErr w:type="gramStart"/>
-      <w:r>
-        <w:rPr>
-          <w:rFonts w:ascii="Montserrat" w:hAnsi="Montserrat"/>
-        </w:rPr>
-        <w:t>in</w:t>
-      </w:r>
-      <w:proofErr w:type="gramEnd"/>
-      <w:r>
-        <w:rPr>
-          <w:rFonts w:ascii="Montserrat" w:hAnsi="Montserrat"/>
-        </w:rPr>
-        <w:t xml:space="preserve"> an Excel sheet. </w:t>
+        <w:t xml:space="preserve">Organize the folder into categories: receipts, invoices, and agreements. Then I want you to add the total receipts and export them in an Excel sheet. </w:t>
       </w:r>
     </w:p>
     <w:p>
@@ -692,6 +678,28 @@
           <w:szCs w:val="24"/>
           <w:u w:val="single"/>
         </w:rPr>
+        <w:br w:type="page"/>
+      </w:r>
+    </w:p>
+    <w:p>
+      <w:pPr>
+        <w:rPr>
+          <w:rFonts w:ascii="Montserrat" w:hAnsi="Montserrat"/>
+          <w:b/>
+          <w:sz w:val="24"/>
+          <w:szCs w:val="24"/>
+          <w:u w:val="single"/>
+        </w:rPr>
+      </w:pPr>
+      <w:r>
+        <w:rPr>
+          <w:rFonts w:ascii="Montserrat" w:hAnsi="Montserrat"/>
+          <w:b/>
+          <w:sz w:val="24"/>
+          <w:szCs w:val="24"/>
+          <w:u w:val="single"/>
+        </w:rPr>
+        <w:lastRenderedPageBreak/>
         <w:t xml:space="preserve">Demo </w:t>
       </w:r>
       <w:r>
@@ -760,13 +768,6 @@
       <w:r>
         <w:rPr>
           <w:rFonts w:ascii="Montserrat" w:hAnsi="Montserrat"/>
-          <w:bCs/>
-        </w:rPr>
-        <w:t xml:space="preserve">Run </w:t>
-      </w:r>
-      <w:r>
-        <w:rPr>
-          <w:rFonts w:ascii="Montserrat" w:hAnsi="Montserrat"/>
           <w:b/>
         </w:rPr>
         <w:t>/explore-data</w:t>
@@ -776,7 +777,21 @@
           <w:rFonts w:ascii="Montserrat" w:hAnsi="Montserrat"/>
           <w:bCs/>
         </w:rPr>
-        <w:t xml:space="preserve"> using the Sales_data.xlsx </w:t>
+        <w:t xml:space="preserve"> using the Sales_</w:t>
+      </w:r>
+      <w:r>
+        <w:rPr>
+          <w:rFonts w:ascii="Montserrat" w:hAnsi="Montserrat"/>
+          <w:bCs/>
+        </w:rPr>
+        <w:t>D</w:t>
+      </w:r>
+      <w:r>
+        <w:rPr>
+          <w:rFonts w:ascii="Montserrat" w:hAnsi="Montserrat"/>
+          <w:bCs/>
+        </w:rPr>
+        <w:t xml:space="preserve">ata.xlsx </w:t>
       </w:r>
     </w:p>
     <w:p>
@@ -794,16 +809,16 @@
       <w:r>
         <w:rPr>
           <w:rFonts w:ascii="Montserrat" w:hAnsi="Montserrat"/>
-          <w:bCs/>
-        </w:rPr>
-        <w:t xml:space="preserve">Run </w:t>
-      </w:r>
-      <w:r>
-        <w:rPr>
-          <w:rFonts w:ascii="Montserrat" w:hAnsi="Montserrat"/>
           <w:b/>
         </w:rPr>
         <w:t>/validate</w:t>
+      </w:r>
+      <w:r>
+        <w:rPr>
+          <w:rFonts w:ascii="Montserrat" w:hAnsi="Montserrat"/>
+          <w:b/>
+        </w:rPr>
+        <w:t>-data</w:t>
       </w:r>
     </w:p>
     <w:p>
@@ -835,22 +850,22 @@
         </w:numPr>
         <w:rPr>
           <w:rFonts w:ascii="Montserrat" w:hAnsi="Montserrat"/>
-          <w:b/>
-        </w:rPr>
-      </w:pPr>
-      <w:r>
-        <w:rPr>
-          <w:rFonts w:ascii="Montserrat" w:hAnsi="Montserrat"/>
-          <w:bCs/>
-        </w:rPr>
-        <w:t xml:space="preserve">Run </w:t>
-      </w:r>
+          <w:bCs/>
+        </w:rPr>
+      </w:pPr>
       <w:r>
         <w:rPr>
           <w:rFonts w:ascii="Montserrat" w:hAnsi="Montserrat"/>
           <w:b/>
         </w:rPr>
         <w:t xml:space="preserve">/build-dashboard </w:t>
+      </w:r>
+      <w:r>
+        <w:rPr>
+          <w:rFonts w:ascii="Montserrat" w:hAnsi="Montserrat"/>
+          <w:bCs/>
+        </w:rPr>
+        <w:t>on the raw Sales_Data.xlsx</w:t>
       </w:r>
     </w:p>
     <w:p>
@@ -868,16 +883,43 @@
       <w:r>
         <w:rPr>
           <w:rFonts w:ascii="Montserrat" w:hAnsi="Montserrat"/>
-          <w:bCs/>
-        </w:rPr>
-        <w:t xml:space="preserve">Run </w:t>
-      </w:r>
-      <w:r>
-        <w:rPr>
-          <w:rFonts w:ascii="Montserrat" w:hAnsi="Montserrat"/>
-          <w:b/>
-        </w:rPr>
-        <w:t xml:space="preserve">/create-viz </w:t>
+          <w:b/>
+        </w:rPr>
+        <w:t>/build-dashboard</w:t>
+      </w:r>
+    </w:p>
+    <w:p>
+      <w:pPr>
+        <w:pStyle w:val="ListParagraph"/>
+        <w:rPr>
+          <w:rFonts w:ascii="Montserrat" w:hAnsi="Montserrat"/>
+          <w:b/>
+        </w:rPr>
+      </w:pPr>
+    </w:p>
+    <w:p>
+      <w:pPr>
+        <w:pStyle w:val="ListParagraph"/>
+        <w:ind w:left="360"/>
+        <w:rPr>
+          <w:rFonts w:ascii="Montserrat" w:hAnsi="Montserrat"/>
+          <w:bCs/>
+        </w:rPr>
+      </w:pPr>
+      <w:r>
+        <w:rPr>
+          <w:rFonts w:ascii="Montserrat" w:hAnsi="Montserrat"/>
+          <w:b/>
+        </w:rPr>
+        <w:t xml:space="preserve"># </w:t>
+      </w:r>
+      <w:r>
+        <w:rPr>
+          <w:rFonts w:ascii="Montserrat" w:hAnsi="Montserrat"/>
+          <w:b/>
+          <w:lang w:val="en"/>
+        </w:rPr>
+        <w:t>data visualization</w:t>
       </w:r>
     </w:p>
     <w:p>
@@ -897,21 +939,23 @@
           <w:rFonts w:ascii="Montserrat" w:hAnsi="Montserrat"/>
           <w:bCs/>
         </w:rPr>
-        <w:t xml:space="preserve">Run </w:t>
-      </w:r>
-      <w:r>
-        <w:rPr>
-          <w:rFonts w:ascii="Montserrat" w:hAnsi="Montserrat"/>
-          <w:b/>
-        </w:rPr>
-        <w:t>/statistical-analysis skill</w:t>
-      </w:r>
-      <w:r>
-        <w:rPr>
-          <w:rFonts w:ascii="Montserrat" w:hAnsi="Montserrat"/>
-          <w:bCs/>
-        </w:rPr>
-        <w:t xml:space="preserve"> </w:t>
+        <w:t xml:space="preserve">/create-viz </w:t>
+      </w:r>
+    </w:p>
+    <w:p>
+      <w:pPr>
+        <w:ind w:left="360"/>
+        <w:rPr>
+          <w:rFonts w:ascii="Montserrat" w:hAnsi="Montserrat"/>
+          <w:bCs/>
+        </w:rPr>
+      </w:pPr>
+      <w:r>
+        <w:rPr>
+          <w:rFonts w:ascii="Montserrat" w:hAnsi="Montserrat"/>
+          <w:bCs/>
+        </w:rPr>
+        <w:t># Analysis Skill</w:t>
       </w:r>
     </w:p>
     <w:p>
@@ -929,11 +973,58 @@
       <w:r>
         <w:rPr>
           <w:rFonts w:ascii="Montserrat" w:hAnsi="Montserrat"/>
+          <w:b/>
+        </w:rPr>
+        <w:t>/analysis</w:t>
+      </w:r>
+      <w:r>
+        <w:rPr>
+          <w:rFonts w:ascii="Montserrat" w:hAnsi="Montserrat"/>
+          <w:bCs/>
+        </w:rPr>
+        <w:t xml:space="preserve"> </w:t>
+      </w:r>
+    </w:p>
+    <w:p>
+      <w:pPr>
+        <w:pStyle w:val="ListParagraph"/>
+        <w:numPr>
+          <w:ilvl w:val="0"/>
+          <w:numId w:val="13"/>
+        </w:numPr>
+        <w:rPr>
+          <w:rFonts w:ascii="Montserrat" w:hAnsi="Montserrat"/>
+          <w:bCs/>
+        </w:rPr>
+      </w:pPr>
+      <w:r>
+        <w:rPr>
+          <w:rFonts w:ascii="Montserrat" w:hAnsi="Montserrat"/>
+          <w:bCs/>
+          <w:lang w:val="en"/>
+        </w:rPr>
+        <w:t>/statistical-analysis</w:t>
+      </w:r>
+    </w:p>
+    <w:p>
+      <w:pPr>
+        <w:pStyle w:val="ListParagraph"/>
+        <w:numPr>
+          <w:ilvl w:val="0"/>
+          <w:numId w:val="13"/>
+        </w:numPr>
+        <w:rPr>
+          <w:rFonts w:ascii="Montserrat" w:hAnsi="Montserrat"/>
+          <w:bCs/>
+        </w:rPr>
+      </w:pPr>
+      <w:r>
+        <w:rPr>
+          <w:rFonts w:ascii="Montserrat" w:hAnsi="Montserrat"/>
           <w:bCs/>
         </w:rPr>
         <w:t xml:space="preserve">Summarize everything you generated in a </w:t>
       </w:r>
-      <w:proofErr w:type="gramStart"/>
       <w:r>
         <w:rPr>
           <w:rFonts w:ascii="Montserrat" w:hAnsi="Montserrat"/>
@@ -946,15 +1037,7 @@
           <w:rFonts w:ascii="Montserrat" w:hAnsi="Montserrat"/>
           <w:bCs/>
         </w:rPr>
-        <w:t xml:space="preserve"> slides</w:t>
-      </w:r>
-      <w:proofErr w:type="gramEnd"/>
-      <w:r>
-        <w:rPr>
-          <w:rFonts w:ascii="Montserrat" w:hAnsi="Montserrat"/>
-          <w:bCs/>
-        </w:rPr>
-        <w:t xml:space="preserve"> to present to my manager </w:t>
+        <w:t xml:space="preserve"> slides to present to my manager </w:t>
       </w:r>
     </w:p>
     <w:p>
@@ -1255,25 +1338,7 @@
           <w:sz w:val="24"/>
           <w:szCs w:val="24"/>
         </w:rPr>
-        <w:t xml:space="preserve">Design Your Personalized </w:t>
-      </w:r>
-      <w:proofErr w:type="spellStart"/>
-      <w:r>
-        <w:rPr>
-          <w:rFonts w:ascii="Montserrat" w:hAnsi="Montserrat"/>
-          <w:sz w:val="24"/>
-          <w:szCs w:val="24"/>
-        </w:rPr>
-        <w:t>Cowork</w:t>
-      </w:r>
-      <w:proofErr w:type="spellEnd"/>
-      <w:r>
-        <w:rPr>
-          <w:rFonts w:ascii="Montserrat" w:hAnsi="Montserrat"/>
-          <w:sz w:val="24"/>
-          <w:szCs w:val="24"/>
-        </w:rPr>
-        <w:t xml:space="preserve"> Finance Automation in Minutes</w:t>
+        <w:t>Design Your Personalized Cowork Finance Automation in Minutes</w:t>
       </w:r>
     </w:p>
     <w:p>
@@ -1312,25 +1377,7 @@
           <w:sz w:val="24"/>
           <w:szCs w:val="24"/>
         </w:rPr>
-        <w:t xml:space="preserve">Design a tailored finance plugin that matches my exact responsibilities and day-to-day processes. Use the details below to construct skills, slash commands, and integrations that reflect how I </w:t>
-      </w:r>
-      <w:proofErr w:type="gramStart"/>
-      <w:r>
-        <w:rPr>
-          <w:rFonts w:ascii="Montserrat" w:hAnsi="Montserrat"/>
-          <w:sz w:val="24"/>
-          <w:szCs w:val="24"/>
-        </w:rPr>
-        <w:t>actually get</w:t>
-      </w:r>
-      <w:proofErr w:type="gramEnd"/>
-      <w:r>
-        <w:rPr>
-          <w:rFonts w:ascii="Montserrat" w:hAnsi="Montserrat"/>
-          <w:sz w:val="24"/>
-          <w:szCs w:val="24"/>
-        </w:rPr>
-        <w:t xml:space="preserve"> work done.</w:t>
+        <w:t>Design a tailored finance plugin that matches my exact responsibilities and day-to-day processes. Use the details below to construct skills, slash commands, and integrations that reflect how I actually get work done.</w:t>
       </w:r>
     </w:p>
     <w:p>
@@ -1564,25 +1611,7 @@
           <w:sz w:val="24"/>
           <w:szCs w:val="24"/>
         </w:rPr>
-        <w:t xml:space="preserve">[e.g., 1,000.00 or </w:t>
-      </w:r>
-      <w:proofErr w:type="gramStart"/>
-      <w:r>
-        <w:rPr>
-          <w:rFonts w:ascii="Montserrat" w:hAnsi="Montserrat"/>
-          <w:sz w:val="24"/>
-          <w:szCs w:val="24"/>
-        </w:rPr>
-        <w:t>1.000,00</w:t>
-      </w:r>
-      <w:proofErr w:type="gramEnd"/>
-      <w:r>
-        <w:rPr>
-          <w:rFonts w:ascii="Montserrat" w:hAnsi="Montserrat"/>
-          <w:sz w:val="24"/>
-          <w:szCs w:val="24"/>
-        </w:rPr>
-        <w:t>]</w:t>
+        <w:t>[e.g., 1,000.00 or 1.000,00]</w:t>
       </w:r>
     </w:p>
     <w:p>
@@ -1799,25 +1828,7 @@
           <w:sz w:val="24"/>
           <w:szCs w:val="24"/>
         </w:rPr>
-        <w:t xml:space="preserve">Enter your expense categories exactly as they appear </w:t>
-      </w:r>
-      <w:proofErr w:type="gramStart"/>
-      <w:r>
-        <w:rPr>
-          <w:rFonts w:ascii="Montserrat" w:hAnsi="Montserrat"/>
-          <w:sz w:val="24"/>
-          <w:szCs w:val="24"/>
-        </w:rPr>
-        <w:t>in</w:t>
-      </w:r>
-      <w:proofErr w:type="gramEnd"/>
-      <w:r>
-        <w:rPr>
-          <w:rFonts w:ascii="Montserrat" w:hAnsi="Montserrat"/>
-          <w:sz w:val="24"/>
-          <w:szCs w:val="24"/>
-        </w:rPr>
-        <w:t xml:space="preserve"> your accounting platform. Sample list shown below:</w:t>
+        <w:t>Enter your expense categories exactly as they appear in your accounting platform. Sample list shown below:</w:t>
       </w:r>
     </w:p>
     <w:p>
@@ -2384,21 +2395,7 @@
         <w:rPr>
           <w:rFonts w:ascii="Montserrat" w:eastAsia="Arial" w:hAnsi="Montserrat" w:cs="Arial"/>
         </w:rPr>
-        <w:t xml:space="preserve">Include side-by-side comparisons </w:t>
-      </w:r>
-      <w:proofErr w:type="gramStart"/>
-      <w:r>
-        <w:rPr>
-          <w:rFonts w:ascii="Montserrat" w:eastAsia="Arial" w:hAnsi="Montserrat" w:cs="Arial"/>
-        </w:rPr>
-        <w:t>to:</w:t>
-      </w:r>
-      <w:proofErr w:type="gramEnd"/>
-      <w:r>
-        <w:rPr>
-          <w:rFonts w:ascii="Montserrat" w:eastAsia="Arial" w:hAnsi="Montserrat" w:cs="Arial"/>
-        </w:rPr>
-        <w:t xml:space="preserve"> the previous month, the same month last year, and the approved budget</w:t>
+        <w:t>Include side-by-side comparisons to: the previous month, the same month last year, and the approved budget</w:t>
       </w:r>
     </w:p>
     <w:p>
@@ -2624,16 +2621,8 @@
         <w:rPr>
           <w:rFonts w:ascii="Montserrat" w:eastAsia="Arial" w:hAnsi="Montserrat" w:cs="Arial"/>
         </w:rPr>
-        <w:t xml:space="preserve">If any transaction or line item is ambiguous, flag it for my attention rather than </w:t>
-      </w:r>
-      <w:proofErr w:type="gramStart"/>
-      <w:r>
-        <w:rPr>
-          <w:rFonts w:ascii="Montserrat" w:eastAsia="Arial" w:hAnsi="Montserrat" w:cs="Arial"/>
-        </w:rPr>
-        <w:t>making an assumption</w:t>
-      </w:r>
-      <w:proofErr w:type="gramEnd"/>
+        <w:t>If any transaction or line item is ambiguous, flag it for my attention rather than making an assumption</w:t>
+      </w:r>
     </w:p>
     <w:p>
       <w:pPr>
@@ -2766,25 +2755,7 @@
           <w:sz w:val="24"/>
           <w:szCs w:val="24"/>
         </w:rPr>
-        <w:t xml:space="preserve">[Snowflake / </w:t>
-      </w:r>
-      <w:proofErr w:type="spellStart"/>
-      <w:r>
-        <w:rPr>
-          <w:rFonts w:ascii="Montserrat" w:hAnsi="Montserrat"/>
-          <w:sz w:val="24"/>
-          <w:szCs w:val="24"/>
-        </w:rPr>
-        <w:t>BigQuery</w:t>
-      </w:r>
-      <w:proofErr w:type="spellEnd"/>
-      <w:r>
-        <w:rPr>
-          <w:rFonts w:ascii="Montserrat" w:hAnsi="Montserrat"/>
-          <w:sz w:val="24"/>
-          <w:szCs w:val="24"/>
-        </w:rPr>
-        <w:t xml:space="preserve"> / Databricks] at [connection details if known]</w:t>
+        <w:t>[Snowflake / BigQuery / Databricks] at [connection details if known]</w:t>
       </w:r>
     </w:p>
     <w:p>
@@ -2901,23 +2872,13 @@
           <w:szCs w:val="24"/>
         </w:rPr>
       </w:pPr>
-      <w:proofErr w:type="gramStart"/>
-      <w:r>
-        <w:rPr>
-          <w:rFonts w:ascii="Montserrat" w:hAnsi="Montserrat"/>
-          <w:sz w:val="24"/>
-          <w:szCs w:val="24"/>
-        </w:rPr>
-        <w:t>Enforce these safeguards at all times</w:t>
-      </w:r>
-      <w:proofErr w:type="gramEnd"/>
-      <w:r>
-        <w:rPr>
-          <w:rFonts w:ascii="Montserrat" w:hAnsi="Montserrat"/>
-          <w:sz w:val="24"/>
-          <w:szCs w:val="24"/>
-        </w:rPr>
-        <w:t>:</w:t>
+      <w:r>
+        <w:rPr>
+          <w:rFonts w:ascii="Montserrat" w:hAnsi="Montserrat"/>
+          <w:sz w:val="24"/>
+          <w:szCs w:val="24"/>
+        </w:rPr>
+        <w:t>Enforce these safeguards at all times:</w:t>
       </w:r>
     </w:p>
     <w:p>
@@ -3610,25 +3571,7 @@
           <w:sz w:val="24"/>
           <w:szCs w:val="24"/>
         </w:rPr>
-        <w:t xml:space="preserve">Quantitative performance indicators (e.g., </w:t>
-      </w:r>
-      <w:proofErr w:type="spellStart"/>
-      <w:r>
-        <w:rPr>
-          <w:rFonts w:ascii="Montserrat" w:eastAsia="Montserrat" w:hAnsi="Montserrat" w:cs="Montserrat"/>
-          <w:sz w:val="24"/>
-          <w:szCs w:val="24"/>
-        </w:rPr>
-        <w:t>Wh</w:t>
-      </w:r>
-      <w:proofErr w:type="spellEnd"/>
-      <w:r>
-        <w:rPr>
-          <w:rFonts w:ascii="Montserrat" w:eastAsia="Montserrat" w:hAnsi="Montserrat" w:cs="Montserrat"/>
-          <w:sz w:val="24"/>
-          <w:szCs w:val="24"/>
-        </w:rPr>
-        <w:t>/kg, charge time, safety benchmarks)</w:t>
+        <w:t>Quantitative performance indicators (e.g., Wh/kg, charge time, safety benchmarks)</w:t>
       </w:r>
     </w:p>
     <w:p>
@@ -4189,25 +4132,7 @@
           <w:sz w:val="24"/>
           <w:szCs w:val="24"/>
         </w:rPr>
-        <w:t xml:space="preserve">Show a detailed step-by-step solution to this problem, and show the </w:t>
-      </w:r>
-      <w:proofErr w:type="gramStart"/>
-      <w:r>
-        <w:rPr>
-          <w:rFonts w:ascii="Montserrat" w:eastAsia="Montserrat" w:hAnsi="Montserrat" w:cs="Montserrat"/>
-          <w:sz w:val="24"/>
-          <w:szCs w:val="24"/>
-        </w:rPr>
-        <w:t>equations  “</w:t>
-      </w:r>
-      <w:proofErr w:type="gramEnd"/>
-      <w:r>
-        <w:rPr>
-          <w:rFonts w:ascii="Montserrat" w:eastAsia="Montserrat" w:hAnsi="Montserrat" w:cs="Montserrat"/>
-          <w:sz w:val="24"/>
-          <w:szCs w:val="24"/>
-        </w:rPr>
-        <w:t>attach problem_solving.pdf”</w:t>
+        <w:t>Show a detailed step-by-step solution to this problem, and show the equations  “attach problem_solving.pdf”</w:t>
       </w:r>
     </w:p>
     <w:p>
@@ -4281,47 +4206,7 @@
           <w:sz w:val="24"/>
           <w:szCs w:val="24"/>
         </w:rPr>
-        <w:t xml:space="preserve">def </w:t>
-      </w:r>
-      <w:proofErr w:type="spellStart"/>
-      <w:r>
-        <w:rPr>
-          <w:rFonts w:ascii="Montserrat" w:hAnsi="Montserrat"/>
-          <w:bCs/>
-          <w:sz w:val="24"/>
-          <w:szCs w:val="24"/>
-        </w:rPr>
-        <w:t>add_</w:t>
-      </w:r>
-      <w:proofErr w:type="gramStart"/>
-      <w:r>
-        <w:rPr>
-          <w:rFonts w:ascii="Montserrat" w:hAnsi="Montserrat"/>
-          <w:bCs/>
-          <w:sz w:val="24"/>
-          <w:szCs w:val="24"/>
-        </w:rPr>
-        <w:t>numbers</w:t>
-      </w:r>
-      <w:proofErr w:type="spellEnd"/>
-      <w:r>
-        <w:rPr>
-          <w:rFonts w:ascii="Montserrat" w:hAnsi="Montserrat"/>
-          <w:bCs/>
-          <w:sz w:val="24"/>
-          <w:szCs w:val="24"/>
-        </w:rPr>
-        <w:t>(</w:t>
-      </w:r>
-      <w:proofErr w:type="gramEnd"/>
-      <w:r>
-        <w:rPr>
-          <w:rFonts w:ascii="Montserrat" w:hAnsi="Montserrat"/>
-          <w:bCs/>
-          <w:sz w:val="24"/>
-          <w:szCs w:val="24"/>
-        </w:rPr>
-        <w:t>num1, num2):</w:t>
+        <w:t>def add_numbers(num1, num2):</w:t>
       </w:r>
     </w:p>
     <w:p>
@@ -4408,108 +4293,26 @@
           <w:sz w:val="24"/>
           <w:szCs w:val="24"/>
         </w:rPr>
-        <w:t xml:space="preserve">result = </w:t>
-      </w:r>
-      <w:proofErr w:type="spellStart"/>
-      <w:r>
-        <w:rPr>
-          <w:rFonts w:ascii="Montserrat" w:hAnsi="Montserrat"/>
-          <w:bCs/>
-          <w:sz w:val="24"/>
-          <w:szCs w:val="24"/>
-        </w:rPr>
-        <w:t>add_</w:t>
-      </w:r>
-      <w:proofErr w:type="gramStart"/>
-      <w:r>
-        <w:rPr>
-          <w:rFonts w:ascii="Montserrat" w:hAnsi="Montserrat"/>
-          <w:bCs/>
-          <w:sz w:val="24"/>
-          <w:szCs w:val="24"/>
-        </w:rPr>
-        <w:t>numbers</w:t>
-      </w:r>
-      <w:proofErr w:type="spellEnd"/>
-      <w:r>
-        <w:rPr>
-          <w:rFonts w:ascii="Montserrat" w:hAnsi="Montserrat"/>
-          <w:bCs/>
-          <w:sz w:val="24"/>
-          <w:szCs w:val="24"/>
-        </w:rPr>
-        <w:t>(</w:t>
-      </w:r>
-      <w:proofErr w:type="gramEnd"/>
-      <w:r>
-        <w:rPr>
-          <w:rFonts w:ascii="Montserrat" w:hAnsi="Montserrat"/>
-          <w:bCs/>
-          <w:sz w:val="24"/>
-          <w:szCs w:val="24"/>
-        </w:rPr>
-        <w:t>5, 10</w:t>
-      </w:r>
-    </w:p>
-    <w:p>
-      <w:pPr>
-        <w:rPr>
-          <w:rFonts w:ascii="Montserrat" w:hAnsi="Montserrat"/>
-          <w:bCs/>
-          <w:sz w:val="24"/>
-          <w:szCs w:val="24"/>
-        </w:rPr>
-      </w:pPr>
-      <w:proofErr w:type="gramStart"/>
-      <w:r>
-        <w:rPr>
-          <w:rFonts w:ascii="Montserrat" w:hAnsi="Montserrat"/>
-          <w:bCs/>
-          <w:sz w:val="24"/>
-          <w:szCs w:val="24"/>
-        </w:rPr>
-        <w:t>print(</w:t>
-      </w:r>
-      <w:proofErr w:type="spellStart"/>
-      <w:proofErr w:type="gramEnd"/>
-      <w:r>
-        <w:rPr>
-          <w:rFonts w:ascii="Montserrat" w:hAnsi="Montserrat"/>
-          <w:bCs/>
-          <w:sz w:val="24"/>
-          <w:szCs w:val="24"/>
-        </w:rPr>
-        <w:t>f"The</w:t>
-      </w:r>
-      <w:proofErr w:type="spellEnd"/>
-      <w:r>
-        <w:rPr>
-          <w:rFonts w:ascii="Montserrat" w:hAnsi="Montserrat"/>
-          <w:bCs/>
-          <w:sz w:val="24"/>
-          <w:szCs w:val="24"/>
-        </w:rPr>
-        <w:t xml:space="preserve"> sum </w:t>
-      </w:r>
-      <w:proofErr w:type="gramStart"/>
-      <w:r>
-        <w:rPr>
-          <w:rFonts w:ascii="Montserrat" w:hAnsi="Montserrat"/>
-          <w:bCs/>
-          <w:sz w:val="24"/>
-          <w:szCs w:val="24"/>
-        </w:rPr>
-        <w:t>is: {result}"</w:t>
-      </w:r>
-      <w:proofErr w:type="gramEnd"/>
-      <w:r>
-        <w:rPr>
-          <w:rFonts w:ascii="Montserrat" w:hAnsi="Montserrat"/>
-          <w:bCs/>
-          <w:sz w:val="24"/>
-          <w:szCs w:val="24"/>
-        </w:rPr>
-        <w:t>)</w:t>
+        <w:t>result = add_numbers(5, 10</w:t>
+      </w:r>
+    </w:p>
+    <w:p>
+      <w:pPr>
+        <w:rPr>
+          <w:rFonts w:ascii="Montserrat" w:hAnsi="Montserrat"/>
+          <w:bCs/>
+          <w:sz w:val="24"/>
+          <w:szCs w:val="24"/>
+        </w:rPr>
+      </w:pPr>
+      <w:r>
+        <w:rPr>
+          <w:rFonts w:ascii="Montserrat" w:hAnsi="Montserrat"/>
+          <w:bCs/>
+          <w:sz w:val="24"/>
+          <w:szCs w:val="24"/>
+        </w:rPr>
+        <w:t>print(f"The sum is: {result}")</w:t>
       </w:r>
     </w:p>
     <w:p>
@@ -5177,25 +4980,7 @@
           <w:sz w:val="24"/>
           <w:szCs w:val="24"/>
         </w:rPr>
-        <w:t xml:space="preserve">Generate a pie chart that shows the number of employees who </w:t>
-      </w:r>
-      <w:proofErr w:type="gramStart"/>
-      <w:r>
-        <w:rPr>
-          <w:rFonts w:ascii="Montserrat" w:hAnsi="Montserrat"/>
-          <w:sz w:val="24"/>
-          <w:szCs w:val="24"/>
-        </w:rPr>
-        <w:t>travels</w:t>
-      </w:r>
-      <w:proofErr w:type="gramEnd"/>
-      <w:r>
-        <w:rPr>
-          <w:rFonts w:ascii="Montserrat" w:hAnsi="Montserrat"/>
-          <w:sz w:val="24"/>
-          <w:szCs w:val="24"/>
-        </w:rPr>
-        <w:t>.</w:t>
+        <w:t>Generate a pie chart that shows the number of employees who travels.</w:t>
       </w:r>
     </w:p>
     <w:p>
@@ -5305,25 +5090,7 @@
           <w:sz w:val="24"/>
           <w:szCs w:val="24"/>
         </w:rPr>
-        <w:t xml:space="preserve">Sort the data in an ascending order based on Age and then sort them based on Monthly income. </w:t>
-      </w:r>
-      <w:proofErr w:type="gramStart"/>
-      <w:r>
-        <w:rPr>
-          <w:rFonts w:ascii="Montserrat" w:hAnsi="Montserrat"/>
-          <w:sz w:val="24"/>
-          <w:szCs w:val="24"/>
-        </w:rPr>
-        <w:t>Both in</w:t>
-      </w:r>
-      <w:proofErr w:type="gramEnd"/>
-      <w:r>
-        <w:rPr>
-          <w:rFonts w:ascii="Montserrat" w:hAnsi="Montserrat"/>
-          <w:sz w:val="24"/>
-          <w:szCs w:val="24"/>
-        </w:rPr>
-        <w:t xml:space="preserve"> an ascending order.</w:t>
+        <w:t>Sort the data in an ascending order based on Age and then sort them based on Monthly income. Both in an ascending order.</w:t>
       </w:r>
     </w:p>
     <w:p>
@@ -5453,25 +5220,7 @@
           <w:sz w:val="24"/>
           <w:szCs w:val="24"/>
         </w:rPr>
-        <w:t xml:space="preserve">Color code yes as Green and </w:t>
-      </w:r>
-      <w:proofErr w:type="gramStart"/>
-      <w:r>
-        <w:rPr>
-          <w:rFonts w:ascii="Montserrat" w:hAnsi="Montserrat"/>
-          <w:sz w:val="24"/>
-          <w:szCs w:val="24"/>
-        </w:rPr>
-        <w:t>no</w:t>
-      </w:r>
-      <w:proofErr w:type="gramEnd"/>
-      <w:r>
-        <w:rPr>
-          <w:rFonts w:ascii="Montserrat" w:hAnsi="Montserrat"/>
-          <w:sz w:val="24"/>
-          <w:szCs w:val="24"/>
-        </w:rPr>
-        <w:t xml:space="preserve"> as red in the attrition column.</w:t>
+        <w:t>Color code yes as Green and no as red in the attrition column.</w:t>
       </w:r>
     </w:p>
     <w:p>
@@ -5492,43 +5241,7 @@
           <w:sz w:val="24"/>
           <w:szCs w:val="24"/>
         </w:rPr>
-        <w:t xml:space="preserve">color code the age column based on the value. Set the oldest </w:t>
-      </w:r>
-      <w:proofErr w:type="gramStart"/>
-      <w:r>
-        <w:rPr>
-          <w:rFonts w:ascii="Montserrat" w:hAnsi="Montserrat"/>
-          <w:sz w:val="24"/>
-          <w:szCs w:val="24"/>
-        </w:rPr>
-        <w:t>people to</w:t>
-      </w:r>
-      <w:proofErr w:type="gramEnd"/>
-      <w:r>
-        <w:rPr>
-          <w:rFonts w:ascii="Montserrat" w:hAnsi="Montserrat"/>
-          <w:sz w:val="24"/>
-          <w:szCs w:val="24"/>
-        </w:rPr>
-        <w:t xml:space="preserve"> black and the youngest </w:t>
-      </w:r>
-      <w:proofErr w:type="gramStart"/>
-      <w:r>
-        <w:rPr>
-          <w:rFonts w:ascii="Montserrat" w:hAnsi="Montserrat"/>
-          <w:sz w:val="24"/>
-          <w:szCs w:val="24"/>
-        </w:rPr>
-        <w:t>people to</w:t>
-      </w:r>
-      <w:proofErr w:type="gramEnd"/>
-      <w:r>
-        <w:rPr>
-          <w:rFonts w:ascii="Montserrat" w:hAnsi="Montserrat"/>
-          <w:sz w:val="24"/>
-          <w:szCs w:val="24"/>
-        </w:rPr>
-        <w:t xml:space="preserve"> white.</w:t>
+        <w:t>color code the age column based on the value. Set the oldest people to black and the youngest people to white.</w:t>
       </w:r>
     </w:p>
     <w:p>
@@ -6708,25 +6421,14 @@
         </w:rPr>
         <w:t xml:space="preserve">You are a senior financial analyst at Blackstone responsible for evaluating the acquisition of </w:t>
       </w:r>
-      <w:proofErr w:type="gramStart"/>
-      <w:r>
-        <w:rPr>
-          <w:rFonts w:ascii="Montserrat" w:hAnsi="Montserrat"/>
-          <w:sz w:val="24"/>
-          <w:szCs w:val="24"/>
-          <w:lang w:val="en-CA"/>
-        </w:rPr>
-        <w:t>cardinal health</w:t>
-      </w:r>
-      <w:proofErr w:type="gramEnd"/>
-      <w:r>
-        <w:rPr>
-          <w:rFonts w:ascii="Montserrat" w:hAnsi="Montserrat"/>
-          <w:sz w:val="24"/>
-          <w:szCs w:val="24"/>
-          <w:lang w:val="en-CA"/>
-        </w:rPr>
-        <w:t xml:space="preserve"> </w:t>
+      <w:r>
+        <w:rPr>
+          <w:rFonts w:ascii="Montserrat" w:hAnsi="Montserrat"/>
+          <w:sz w:val="24"/>
+          <w:szCs w:val="24"/>
+          <w:lang w:val="en-CA"/>
+        </w:rPr>
+        <w:t xml:space="preserve">cardinal health </w:t>
       </w:r>
       <w:r>
         <w:rPr>
@@ -7139,27 +6841,7 @@
           <w:szCs w:val="24"/>
           <w:lang w:val="en-CA"/>
         </w:rPr>
-        <w:t xml:space="preserve">Add basic formatting (headers, borders, currency formats) to make the output </w:t>
-      </w:r>
-      <w:proofErr w:type="gramStart"/>
-      <w:r>
-        <w:rPr>
-          <w:rFonts w:ascii="Montserrat" w:hAnsi="Montserrat"/>
-          <w:sz w:val="24"/>
-          <w:szCs w:val="24"/>
-          <w:lang w:val="en-CA"/>
-        </w:rPr>
-        <w:t>presentation-ready</w:t>
-      </w:r>
-      <w:proofErr w:type="gramEnd"/>
-      <w:r>
-        <w:rPr>
-          <w:rFonts w:ascii="Montserrat" w:hAnsi="Montserrat"/>
-          <w:sz w:val="24"/>
-          <w:szCs w:val="24"/>
-          <w:lang w:val="en-CA"/>
-        </w:rPr>
-        <w:t>.</w:t>
+        <w:t>Add basic formatting (headers, borders, currency formats) to make the output presentation-ready.</w:t>
       </w:r>
     </w:p>
     <w:p>
@@ -7837,25 +7519,14 @@
           <w:lang w:val="en-CA"/>
         </w:rPr>
       </w:pPr>
-      <w:proofErr w:type="gramStart"/>
-      <w:r>
-        <w:rPr>
-          <w:rFonts w:ascii="Montserrat" w:hAnsi="Montserrat"/>
-          <w:sz w:val="24"/>
-          <w:szCs w:val="24"/>
-          <w:lang w:val="en-CA"/>
-        </w:rPr>
-        <w:t>Investor</w:t>
-      </w:r>
-      <w:proofErr w:type="gramEnd"/>
-      <w:r>
-        <w:rPr>
-          <w:rFonts w:ascii="Montserrat" w:hAnsi="Montserrat"/>
-          <w:sz w:val="24"/>
-          <w:szCs w:val="24"/>
-          <w:lang w:val="en-CA"/>
-        </w:rPr>
-        <w:t xml:space="preserve"> return multiple (MOIC)</w:t>
+      <w:r>
+        <w:rPr>
+          <w:rFonts w:ascii="Montserrat" w:hAnsi="Montserrat"/>
+          <w:sz w:val="24"/>
+          <w:szCs w:val="24"/>
+          <w:lang w:val="en-CA"/>
+        </w:rPr>
+        <w:t>Investor return multiple (MOIC)</w:t>
       </w:r>
     </w:p>
     <w:p>
@@ -8683,25 +8354,7 @@
           <w:bCs/>
           <w:lang w:val="en-CA"/>
         </w:rPr>
-        <w:t xml:space="preserve">Add speaking notes to the slide or </w:t>
-      </w:r>
-      <w:proofErr w:type="gramStart"/>
-      <w:r>
-        <w:rPr>
-          <w:rFonts w:ascii="Montserrat" w:hAnsi="Montserrat"/>
-          <w:bCs/>
-          <w:lang w:val="en-CA"/>
-        </w:rPr>
-        <w:t>Tell</w:t>
-      </w:r>
-      <w:proofErr w:type="gramEnd"/>
-      <w:r>
-        <w:rPr>
-          <w:rFonts w:ascii="Montserrat" w:hAnsi="Montserrat"/>
-          <w:bCs/>
-          <w:lang w:val="en-CA"/>
-        </w:rPr>
-        <w:t xml:space="preserve"> me what to say on each slide</w:t>
+        <w:t>Add speaking notes to the slide or Tell me what to say on each slide</w:t>
       </w:r>
     </w:p>
     <w:p>
@@ -15489,7 +15142,6 @@
   <w:style w:type="character" w:default="1" w:styleId="DefaultParagraphFont">
     <w:name w:val="Default Paragraph Font"/>
     <w:uiPriority w:val="1"/>
-    <w:semiHidden/>
     <w:unhideWhenUsed/>
   </w:style>
   <w:style w:type="table" w:default="1" w:styleId="TableNormal">
@@ -15628,6 +15280,50 @@
       <w:color w:val="605E5C"/>
       <w:shd w:val="clear" w:color="auto" w:fill="E1DFDD"/>
     </w:rPr>
+  </w:style>
+  <w:style w:type="paragraph" w:styleId="Header">
+    <w:name w:val="header"/>
+    <w:basedOn w:val="Normal"/>
+    <w:link w:val="HeaderChar"/>
+    <w:uiPriority w:val="99"/>
+    <w:unhideWhenUsed/>
+    <w:rsid w:val="0026628B"/>
+    <w:pPr>
+      <w:tabs>
+        <w:tab w:val="center" w:pos="4320"/>
+        <w:tab w:val="right" w:pos="8640"/>
+      </w:tabs>
+      <w:spacing w:line="240" w:lineRule="auto"/>
+    </w:pPr>
+  </w:style>
+  <w:style w:type="character" w:customStyle="1" w:styleId="HeaderChar">
+    <w:name w:val="Header Char"/>
+    <w:basedOn w:val="DefaultParagraphFont"/>
+    <w:link w:val="Header"/>
+    <w:uiPriority w:val="99"/>
+    <w:rsid w:val="0026628B"/>
+  </w:style>
+  <w:style w:type="paragraph" w:styleId="Footer">
+    <w:name w:val="footer"/>
+    <w:basedOn w:val="Normal"/>
+    <w:link w:val="FooterChar"/>
+    <w:uiPriority w:val="99"/>
+    <w:unhideWhenUsed/>
+    <w:rsid w:val="0026628B"/>
+    <w:pPr>
+      <w:tabs>
+        <w:tab w:val="center" w:pos="4320"/>
+        <w:tab w:val="right" w:pos="8640"/>
+      </w:tabs>
+      <w:spacing w:line="240" w:lineRule="auto"/>
+    </w:pPr>
+  </w:style>
+  <w:style w:type="character" w:customStyle="1" w:styleId="FooterChar">
+    <w:name w:val="Footer Char"/>
+    <w:basedOn w:val="DefaultParagraphFont"/>
+    <w:link w:val="Footer"/>
+    <w:uiPriority w:val="99"/>
+    <w:rsid w:val="0026628B"/>
   </w:style>
 </w:styles>
 </file>

</xml_diff>

<commit_message>
Add Cowork module content, SKILL.md metadata, and batch service design
- Extend README-BCowork.md with custom financial plugin and data analysis practice prompts
- Add metadata fields to Financial Forecasting SKILL.md (version, author, tools)
- Update Prompt Library with 2025 bank data reference and spacing fixes
- Add batch-service-design.md for international banking settlement platform

Co-Authored-By: Claude Sonnet 4.6 <noreply@anthropic.com>
</commit_message>
<xml_diff>
--- a/Claude Masterclass Materials/Claude Masterclass - Prompt Library.docx
+++ b/Claude Masterclass Materials/Claude Masterclass - Prompt Library.docx
@@ -1270,6 +1270,28 @@
           <w:szCs w:val="24"/>
           <w:u w:val="single"/>
         </w:rPr>
+        <w:br w:type="page"/>
+      </w:r>
+    </w:p>
+    <w:p>
+      <w:pPr>
+        <w:rPr>
+          <w:rFonts w:ascii="Montserrat" w:hAnsi="Montserrat"/>
+          <w:b/>
+          <w:sz w:val="24"/>
+          <w:szCs w:val="24"/>
+          <w:u w:val="single"/>
+        </w:rPr>
+      </w:pPr>
+      <w:r>
+        <w:rPr>
+          <w:rFonts w:ascii="Montserrat" w:hAnsi="Montserrat"/>
+          <w:b/>
+          <w:sz w:val="24"/>
+          <w:szCs w:val="24"/>
+          <w:u w:val="single"/>
+        </w:rPr>
+        <w:lastRenderedPageBreak/>
         <w:t xml:space="preserve">Demo </w:t>
       </w:r>
       <w:r>
@@ -1317,10 +1339,21 @@
           <w:rFonts w:ascii="Montserrat" w:hAnsi="Montserrat"/>
           <w:b/>
           <w:bCs/>
-          <w:sz w:val="24"/>
-          <w:szCs w:val="24"/>
-        </w:rPr>
-        <w:t>Custom Finance Plugin Setup Guide</w:t>
+          <w:color w:val="EE0000"/>
+          <w:sz w:val="24"/>
+          <w:szCs w:val="24"/>
+        </w:rPr>
+        <w:t xml:space="preserve">Custom Finance Plugin </w:t>
+      </w:r>
+      <w:r>
+        <w:rPr>
+          <w:rFonts w:ascii="Montserrat" w:hAnsi="Montserrat"/>
+          <w:b/>
+          <w:bCs/>
+          <w:sz w:val="24"/>
+          <w:szCs w:val="24"/>
+        </w:rPr>
+        <w:t>Setup Guide</w:t>
       </w:r>
     </w:p>
     <w:p>
@@ -1358,7 +1391,6 @@
           <w:sz w:val="24"/>
           <w:szCs w:val="24"/>
         </w:rPr>
-        <w:lastRenderedPageBreak/>
         <w:t>The Setup Prompt</w:t>
       </w:r>
     </w:p>
@@ -1769,6 +1801,7 @@
         <w:rPr>
           <w:rFonts w:ascii="Montserrat" w:eastAsia="Arial" w:hAnsi="Montserrat" w:cs="Arial"/>
         </w:rPr>
+        <w:lastRenderedPageBreak/>
         <w:t>Operating Expenses: 6000–6999 (Payroll 6100s, Occupancy 6200s, Marketing 6300s, Technology 6400s, Professional Fees 6500s, Travel 6600s)</w:t>
       </w:r>
     </w:p>
@@ -1809,7 +1842,6 @@
           <w:sz w:val="24"/>
           <w:szCs w:val="24"/>
         </w:rPr>
-        <w:lastRenderedPageBreak/>
         <w:t>Expense Classification List</w:t>
       </w:r>
     </w:p>
@@ -2250,6 +2282,7 @@
         <w:rPr>
           <w:rFonts w:ascii="Montserrat" w:eastAsia="Arial" w:hAnsi="Montserrat" w:cs="Arial"/>
         </w:rPr>
+        <w:lastRenderedPageBreak/>
         <w:t>Supply written explanations for the top [5] most significant variances</w:t>
       </w:r>
     </w:p>
@@ -2318,7 +2351,6 @@
           <w:sz w:val="24"/>
           <w:szCs w:val="24"/>
         </w:rPr>
-        <w:lastRenderedPageBreak/>
         <w:t>Workflow 2: Financial Statements</w:t>
       </w:r>
     </w:p>
@@ -2747,6 +2779,7 @@
           <w:sz w:val="24"/>
           <w:szCs w:val="24"/>
         </w:rPr>
+        <w:lastRenderedPageBreak/>
         <w:t xml:space="preserve">Data Warehouse: </w:t>
       </w:r>
       <w:r>
@@ -2831,7 +2864,6 @@
           <w:sz w:val="24"/>
           <w:szCs w:val="24"/>
         </w:rPr>
-        <w:lastRenderedPageBreak/>
         <w:t xml:space="preserve">Additional Tools: </w:t>
       </w:r>
       <w:r>
@@ -3063,6 +3095,28 @@
           <w:szCs w:val="24"/>
           <w:u w:val="single"/>
         </w:rPr>
+        <w:br w:type="page"/>
+      </w:r>
+    </w:p>
+    <w:p>
+      <w:pPr>
+        <w:rPr>
+          <w:rFonts w:ascii="Montserrat" w:hAnsi="Montserrat"/>
+          <w:b/>
+          <w:sz w:val="24"/>
+          <w:szCs w:val="24"/>
+          <w:u w:val="single"/>
+        </w:rPr>
+      </w:pPr>
+      <w:r>
+        <w:rPr>
+          <w:rFonts w:ascii="Montserrat" w:hAnsi="Montserrat"/>
+          <w:b/>
+          <w:sz w:val="24"/>
+          <w:szCs w:val="24"/>
+          <w:u w:val="single"/>
+        </w:rPr>
+        <w:lastRenderedPageBreak/>
         <w:t>MODULE 3: CLAUDE CHAT</w:t>
       </w:r>
     </w:p>
@@ -3118,7 +3172,25 @@
           <w:sz w:val="24"/>
           <w:szCs w:val="24"/>
         </w:rPr>
-        <w:t>List the top 10 largest banks in the US by assets in 2024 and show their revenues.</w:t>
+        <w:t>List the top 10 largest banks in the US by assets in 202</w:t>
+      </w:r>
+      <w:r>
+        <w:rPr>
+          <w:rFonts w:ascii="Montserrat" w:eastAsia="Montserrat" w:hAnsi="Montserrat" w:cs="Montserrat"/>
+          <w:i/>
+          <w:sz w:val="24"/>
+          <w:szCs w:val="24"/>
+        </w:rPr>
+        <w:t>5</w:t>
+      </w:r>
+      <w:r>
+        <w:rPr>
+          <w:rFonts w:ascii="Montserrat" w:eastAsia="Montserrat" w:hAnsi="Montserrat" w:cs="Montserrat"/>
+          <w:i/>
+          <w:sz w:val="24"/>
+          <w:szCs w:val="24"/>
+        </w:rPr>
+        <w:t xml:space="preserve"> and show their revenues.</w:t>
       </w:r>
     </w:p>
     <w:p>
@@ -3242,7 +3314,6 @@
           <w:sz w:val="24"/>
           <w:szCs w:val="24"/>
         </w:rPr>
-        <w:lastRenderedPageBreak/>
         <w:t>Instruction:</w:t>
       </w:r>
       <w:r>
@@ -3468,6 +3539,7 @@
           <w:sz w:val="24"/>
           <w:szCs w:val="24"/>
         </w:rPr>
+        <w:lastRenderedPageBreak/>
         <w:t>Input:</w:t>
       </w:r>
       <w:r>
@@ -3686,7 +3758,6 @@
           <w:sz w:val="24"/>
           <w:szCs w:val="24"/>
         </w:rPr>
-        <w:lastRenderedPageBreak/>
         <w:t>Write a professional email to Richard Marino, who is the owner of a famous Italian restaurant in Toronto, Canada, offering content creation services to his restaurant. Highlight my value in improving their audience reach, mention 2 examples of content I can deliver, and end with a clear invitation to connect.</w:t>
       </w:r>
     </w:p>
@@ -3936,6 +4007,7 @@
           <w:sz w:val="24"/>
           <w:szCs w:val="24"/>
         </w:rPr>
+        <w:lastRenderedPageBreak/>
         <w:t>Information Extraction &amp; Research Assistance:</w:t>
       </w:r>
     </w:p>
@@ -4225,7 +4297,6 @@
           <w:sz w:val="24"/>
           <w:szCs w:val="24"/>
         </w:rPr>
-        <w:lastRenderedPageBreak/>
         <w:t xml:space="preserve">    """Returns the sum of two numbers."""</w:t>
       </w:r>
     </w:p>
@@ -4516,18 +4587,28 @@
           <w:sz w:val="24"/>
           <w:szCs w:val="24"/>
         </w:rPr>
-        <w:t>Generate an epic panoramic illustration featuring the New Seven Wonders of the World together in one majestic landscape: the Great Wall of China winding across distant mountains, the rose-red cliffs of Petra with its carved Treasury, the towering Christ the Redeemer statue overlooking the scene, Machu Picchu perched high in the Andes with misty clouds, the pyramid of Chichen Itza rising in the foreground, the grand Roman Colosseum standing strong, and the glowing white Taj Mahal reflecting in a pool. The Great Pyramid of Giza is shown nearby under golden sunlight as an honorary wonder. The entire scene is unified in a dramatic, cinematic style with vibrant colors, warm light, and awe-inspiring scale.</w:t>
-      </w:r>
-    </w:p>
-    <w:p>
-      <w:pPr>
-        <w:spacing w:line="259" w:lineRule="auto"/>
+        <w:t xml:space="preserve">Generate an epic panoramic illustration featuring the New Seven Wonders of the World together in one majestic landscape: the Great Wall of China winding across distant mountains, the rose-red cliffs of Petra with its carved Treasury, the towering Christ the Redeemer statue overlooking the scene, Machu </w:t>
+      </w:r>
+      <w:r>
         <w:rPr>
           <w:rFonts w:ascii="Montserrat" w:eastAsia="Montserrat" w:hAnsi="Montserrat" w:cs="Montserrat"/>
           <w:i/>
           <w:sz w:val="24"/>
           <w:szCs w:val="24"/>
         </w:rPr>
+        <w:lastRenderedPageBreak/>
+        <w:t>Picchu perched high in the Andes with misty clouds, the pyramid of Chichen Itza rising in the foreground, the grand Roman Colosseum standing strong, and the glowing white Taj Mahal reflecting in a pool. The Great Pyramid of Giza is shown nearby under golden sunlight as an honorary wonder. The entire scene is unified in a dramatic, cinematic style with vibrant colors, warm light, and awe-inspiring scale.</w:t>
+      </w:r>
+    </w:p>
+    <w:p>
+      <w:pPr>
+        <w:spacing w:line="259" w:lineRule="auto"/>
+        <w:rPr>
+          <w:rFonts w:ascii="Montserrat" w:eastAsia="Montserrat" w:hAnsi="Montserrat" w:cs="Montserrat"/>
+          <w:i/>
+          <w:sz w:val="24"/>
+          <w:szCs w:val="24"/>
+        </w:rPr>
       </w:pPr>
     </w:p>
     <w:p>
@@ -4713,7 +4794,6 @@
           <w:sz w:val="24"/>
           <w:szCs w:val="24"/>
         </w:rPr>
-        <w:lastRenderedPageBreak/>
         <w:t>**Using Human_resources.xlsx file**</w:t>
       </w:r>
     </w:p>
@@ -5637,6 +5717,7 @@
           <w:szCs w:val="24"/>
           <w:lang w:val="en-CA"/>
         </w:rPr>
+        <w:lastRenderedPageBreak/>
         <w:t>Build a fully dynamic 10-year financial model with adjustable assumptions.</w:t>
       </w:r>
     </w:p>
@@ -5850,7 +5931,6 @@
           <w:szCs w:val="24"/>
           <w:lang w:val="en-CA"/>
         </w:rPr>
-        <w:lastRenderedPageBreak/>
         <w:t>Research summary on Toronto condo appreciation outlook with justified base, bull, and bear assumptions.</w:t>
       </w:r>
     </w:p>
@@ -6226,6 +6306,7 @@
           <w:szCs w:val="24"/>
           <w:lang w:val="en-CA"/>
         </w:rPr>
+        <w:lastRenderedPageBreak/>
         <w:t>All formulas must be clearly shown.</w:t>
       </w:r>
     </w:p>
@@ -6483,7 +6564,6 @@
           <w:szCs w:val="24"/>
           <w:lang w:val="en-CA"/>
         </w:rPr>
-        <w:lastRenderedPageBreak/>
         <w:t>Your task is to create a fully functional DCF model in Excel based on provided input data.</w:t>
       </w:r>
     </w:p>
@@ -6928,6 +7008,7 @@
           <w:szCs w:val="24"/>
           <w:lang w:val="en-CA"/>
         </w:rPr>
+        <w:lastRenderedPageBreak/>
         <w:t>Year 1 to Year 5 Free Cash Flow projections (in USD millions)</w:t>
       </w:r>
     </w:p>
@@ -7152,17 +7233,7 @@
           <w:szCs w:val="24"/>
           <w:lang w:val="en-CA"/>
         </w:rPr>
-        <w:t xml:space="preserve">You are an investment professional at Blackstone evaluating a potential leveraged buyout (LBO) transaction. You want to analyze the deal structure, </w:t>
-      </w:r>
-      <w:r>
-        <w:rPr>
-          <w:rFonts w:ascii="Montserrat" w:hAnsi="Montserrat"/>
-          <w:sz w:val="24"/>
-          <w:szCs w:val="24"/>
-          <w:lang w:val="en-CA"/>
-        </w:rPr>
-        <w:lastRenderedPageBreak/>
-        <w:t>including debt and equity financing, debt repayment schedule, and investor return multiples.</w:t>
+        <w:t>You are an investment professional at Blackstone evaluating a potential leveraged buyout (LBO) transaction. You want to analyze the deal structure, including debt and equity financing, debt repayment schedule, and investor return multiples.</w:t>
       </w:r>
     </w:p>
     <w:p>
@@ -7526,6 +7597,7 @@
           <w:szCs w:val="24"/>
           <w:lang w:val="en-CA"/>
         </w:rPr>
+        <w:lastRenderedPageBreak/>
         <w:t>Investor return multiple (MOIC)</w:t>
       </w:r>
     </w:p>
@@ -7816,7 +7888,6 @@
           <w:b/>
           <w:lang w:val="en-CA"/>
         </w:rPr>
-        <w:lastRenderedPageBreak/>
         <w:t>Add Speaking Notes</w:t>
       </w:r>
     </w:p>
@@ -8093,6 +8164,7 @@
           <w:bCs/>
           <w:lang w:val="en-CA"/>
         </w:rPr>
+        <w:lastRenderedPageBreak/>
         <w:t xml:space="preserve">Create a presentation from </w:t>
       </w:r>
       <w:hyperlink r:id="rId12" w:history="1">
@@ -8528,6 +8600,7 @@
           <w:bCs/>
           <w:lang w:val="en-CA"/>
         </w:rPr>
+        <w:lastRenderedPageBreak/>
         <w:t>How can I make the presentation more engaging?</w:t>
       </w:r>
     </w:p>
@@ -8772,7 +8845,6 @@
           <w:szCs w:val="24"/>
           <w:lang w:val="en-CA"/>
         </w:rPr>
-        <w:lastRenderedPageBreak/>
         <w:t>Prompt 2</w:t>
       </w:r>
       <w:r>
@@ -9128,7 +9200,17 @@
           <w:szCs w:val="24"/>
           <w:lang w:val="en-CA"/>
         </w:rPr>
-        <w:t xml:space="preserve"> Explore the relationship between weather conditions and weekly revenue.</w:t>
+        <w:t xml:space="preserve"> Explore the relationship between weather conditions and weekly </w:t>
+      </w:r>
+      <w:r>
+        <w:rPr>
+          <w:rFonts w:ascii="Montserrat" w:eastAsia="Times New Roman" w:hAnsi="Montserrat"/>
+          <w:sz w:val="24"/>
+          <w:szCs w:val="24"/>
+          <w:lang w:val="en-CA"/>
+        </w:rPr>
+        <w:lastRenderedPageBreak/>
+        <w:t>revenue.</w:t>
       </w:r>
       <w:r>
         <w:rPr>
@@ -15142,6 +15224,7 @@
   <w:style w:type="character" w:default="1" w:styleId="DefaultParagraphFont">
     <w:name w:val="Default Paragraph Font"/>
     <w:uiPriority w:val="1"/>
+    <w:semiHidden/>
     <w:unhideWhenUsed/>
   </w:style>
   <w:style w:type="table" w:default="1" w:styleId="TableNormal">

</xml_diff>

<commit_message>
Add Claude Chat and ESG scoring docs, update Prompt Library
- Add README-CChat.md: Claude Chat example with prompt components
- Add README-ESG.md: ESG scoring integration guide for trade finance LC process (Traditional Chinese)
- Fix capitalization in Prompt Library (Wh/kg → Wh/Kg)

Co-Authored-By: Claude Sonnet 4.6 <noreply@anthropic.com>
</commit_message>
<xml_diff>
--- a/Claude Masterclass Materials/Claude Masterclass - Prompt Library.docx
+++ b/Claude Masterclass Materials/Claude Masterclass - Prompt Library.docx
@@ -2788,7 +2788,25 @@
           <w:sz w:val="24"/>
           <w:szCs w:val="24"/>
         </w:rPr>
-        <w:t>[Snowflake / BigQuery / Databricks] at [connection details if known]</w:t>
+        <w:t xml:space="preserve">[Snowflake / </w:t>
+      </w:r>
+      <w:proofErr w:type="spellStart"/>
+      <w:r>
+        <w:rPr>
+          <w:rFonts w:ascii="Montserrat" w:hAnsi="Montserrat"/>
+          <w:sz w:val="24"/>
+          <w:szCs w:val="24"/>
+        </w:rPr>
+        <w:t>BigQuery</w:t>
+      </w:r>
+      <w:proofErr w:type="spellEnd"/>
+      <w:r>
+        <w:rPr>
+          <w:rFonts w:ascii="Montserrat" w:hAnsi="Montserrat"/>
+          <w:sz w:val="24"/>
+          <w:szCs w:val="24"/>
+        </w:rPr>
+        <w:t xml:space="preserve"> / Databricks] at [connection details if known]</w:t>
       </w:r>
     </w:p>
     <w:p>
@@ -3643,7 +3661,41 @@
           <w:sz w:val="24"/>
           <w:szCs w:val="24"/>
         </w:rPr>
-        <w:t>Quantitative performance indicators (e.g., Wh/kg, charge time, safety benchmarks)</w:t>
+        <w:t xml:space="preserve">Quantitative performance indicators (e.g., </w:t>
+      </w:r>
+      <w:proofErr w:type="spellStart"/>
+      <w:r>
+        <w:rPr>
+          <w:rFonts w:ascii="Montserrat" w:eastAsia="Montserrat" w:hAnsi="Montserrat" w:cs="Montserrat"/>
+          <w:sz w:val="24"/>
+          <w:szCs w:val="24"/>
+        </w:rPr>
+        <w:t>Wh</w:t>
+      </w:r>
+      <w:proofErr w:type="spellEnd"/>
+      <w:r>
+        <w:rPr>
+          <w:rFonts w:ascii="Montserrat" w:eastAsia="Montserrat" w:hAnsi="Montserrat" w:cs="Montserrat"/>
+          <w:sz w:val="24"/>
+          <w:szCs w:val="24"/>
+        </w:rPr>
+        <w:t>/</w:t>
+      </w:r>
+      <w:r>
+        <w:rPr>
+          <w:rFonts w:ascii="Montserrat" w:eastAsia="Montserrat" w:hAnsi="Montserrat" w:cs="Montserrat"/>
+          <w:sz w:val="24"/>
+          <w:szCs w:val="24"/>
+        </w:rPr>
+        <w:t>K</w:t>
+      </w:r>
+      <w:r>
+        <w:rPr>
+          <w:rFonts w:ascii="Montserrat" w:eastAsia="Montserrat" w:hAnsi="Montserrat" w:cs="Montserrat"/>
+          <w:sz w:val="24"/>
+          <w:szCs w:val="24"/>
+        </w:rPr>
+        <w:t>g, charge time, safety benchmarks)</w:t>
       </w:r>
     </w:p>
     <w:p>
@@ -4278,7 +4330,27 @@
           <w:sz w:val="24"/>
           <w:szCs w:val="24"/>
         </w:rPr>
-        <w:t>def add_numbers(num1, num2):</w:t>
+        <w:t xml:space="preserve">def </w:t>
+      </w:r>
+      <w:proofErr w:type="spellStart"/>
+      <w:r>
+        <w:rPr>
+          <w:rFonts w:ascii="Montserrat" w:hAnsi="Montserrat"/>
+          <w:bCs/>
+          <w:sz w:val="24"/>
+          <w:szCs w:val="24"/>
+        </w:rPr>
+        <w:t>add_numbers</w:t>
+      </w:r>
+      <w:proofErr w:type="spellEnd"/>
+      <w:r>
+        <w:rPr>
+          <w:rFonts w:ascii="Montserrat" w:hAnsi="Montserrat"/>
+          <w:bCs/>
+          <w:sz w:val="24"/>
+          <w:szCs w:val="24"/>
+        </w:rPr>
+        <w:t>(num1, num2):</w:t>
       </w:r>
     </w:p>
     <w:p>
@@ -4364,26 +4436,66 @@
           <w:sz w:val="24"/>
           <w:szCs w:val="24"/>
         </w:rPr>
-        <w:t>result = add_numbers(5, 10</w:t>
-      </w:r>
-    </w:p>
-    <w:p>
-      <w:pPr>
-        <w:rPr>
-          <w:rFonts w:ascii="Montserrat" w:hAnsi="Montserrat"/>
-          <w:bCs/>
-          <w:sz w:val="24"/>
-          <w:szCs w:val="24"/>
-        </w:rPr>
-      </w:pPr>
-      <w:r>
-        <w:rPr>
-          <w:rFonts w:ascii="Montserrat" w:hAnsi="Montserrat"/>
-          <w:bCs/>
-          <w:sz w:val="24"/>
-          <w:szCs w:val="24"/>
-        </w:rPr>
-        <w:t>print(f"The sum is: {result}")</w:t>
+        <w:t xml:space="preserve">result = </w:t>
+      </w:r>
+      <w:proofErr w:type="spellStart"/>
+      <w:r>
+        <w:rPr>
+          <w:rFonts w:ascii="Montserrat" w:hAnsi="Montserrat"/>
+          <w:bCs/>
+          <w:sz w:val="24"/>
+          <w:szCs w:val="24"/>
+        </w:rPr>
+        <w:t>add_numbers</w:t>
+      </w:r>
+      <w:proofErr w:type="spellEnd"/>
+      <w:r>
+        <w:rPr>
+          <w:rFonts w:ascii="Montserrat" w:hAnsi="Montserrat"/>
+          <w:bCs/>
+          <w:sz w:val="24"/>
+          <w:szCs w:val="24"/>
+        </w:rPr>
+        <w:t>(5, 10</w:t>
+      </w:r>
+    </w:p>
+    <w:p>
+      <w:pPr>
+        <w:rPr>
+          <w:rFonts w:ascii="Montserrat" w:hAnsi="Montserrat"/>
+          <w:bCs/>
+          <w:sz w:val="24"/>
+          <w:szCs w:val="24"/>
+        </w:rPr>
+      </w:pPr>
+      <w:r>
+        <w:rPr>
+          <w:rFonts w:ascii="Montserrat" w:hAnsi="Montserrat"/>
+          <w:bCs/>
+          <w:sz w:val="24"/>
+          <w:szCs w:val="24"/>
+        </w:rPr>
+        <w:t>print(</w:t>
+      </w:r>
+      <w:proofErr w:type="spellStart"/>
+      <w:r>
+        <w:rPr>
+          <w:rFonts w:ascii="Montserrat" w:hAnsi="Montserrat"/>
+          <w:bCs/>
+          <w:sz w:val="24"/>
+          <w:szCs w:val="24"/>
+        </w:rPr>
+        <w:t>f"The</w:t>
+      </w:r>
+      <w:proofErr w:type="spellEnd"/>
+      <w:r>
+        <w:rPr>
+          <w:rFonts w:ascii="Montserrat" w:hAnsi="Montserrat"/>
+          <w:bCs/>
+          <w:sz w:val="24"/>
+          <w:szCs w:val="24"/>
+        </w:rPr>
+        <w:t xml:space="preserve"> sum is: {result}")</w:t>
       </w:r>
     </w:p>
     <w:p>

</xml_diff>